<commit_message>
feat(brand): real state crest in the demo, a real SBC brochure as the good sample, statutory bodies use their own logo
- Demo files use the Jata Negeri Sarawak (Wikimedia Commons, public domain).
  Sample 1 is the Sarawak Biodiversity Centre's real brochure; sample 2 a UKAS
  draft to rework (agency logo bigger than the crest, Jabatan Ketua Menteri, the
  One Government counter logo, Gmail); 2b the fixed version.
- Statutory bodies and councils (CM 47/75) are not held to the crest, state
  colour and font rules. Contacts may use the body's own official domain.
- Official titles is only Premier vs Chief Minister for the current office;
  "Sarawak Government" becomes a good-practice tip (BC-4.6).
- Items show the issue and what to do; no Why it matters.

Co-Authored-By: Claude Opus 5.5 <noreply@anthropic.com>
</commit_message>
<xml_diff>
--- a/public/templates/brand/UKAS-BG-01-Sarawak-Government-Brand-Guide-Draft-v0.2.docx
+++ b/public/templates/brand/UKAS-BG-01-Sarawak-Government-Brand-Guide-Draft-v0.2.docx
@@ -55,7 +55,7 @@
     </w:p>
     <w:p>
       <w:r>
-        <w:t>Every design an agency sends out, from slides and brochures to posters and social posts, is checked against the 34 rules in this guide. 6 rules are official. The check takes about a minute and shows what to fix and where.</w:t>
+        <w:t>Every design an agency sends out, from slides and brochures to posters and social posts, is checked against the 35 rules in this guide. 6 rules are official. The check takes about a minute and shows what to fix and where.</w:t>
       </w:r>
     </w:p>
     <w:p>
@@ -596,7 +596,7 @@
           </w:tcPr>
           <w:p>
             <w:r>
-              <w:t>Put the Sarawak crest on the cover or first page.</w:t>
+              <w:t>Ministries and departments: put the Sarawak crest on the cover or first page.</w:t>
             </w:r>
           </w:p>
         </w:tc>
@@ -1430,7 +1430,7 @@
           </w:tcPr>
           <w:p>
             <w:r>
-              <w:t>Say "Premier of Sarawak", not "Chief Minister". Say "Sarawak Government".</w:t>
+              <w:t>Say "Premier of Sarawak" (Premier Sarawak), not "Chief Minister" or "Ketua Menteri".</w:t>
             </w:r>
           </w:p>
         </w:tc>
@@ -1567,6 +1567,48 @@
           <w:p>
             <w:r>
               <w:t>Should fix</w:t>
+            </w:r>
+          </w:p>
+        </w:tc>
+        <w:tc>
+          <w:tcPr>
+            <w:tcW w:type="dxa" w:w="2041"/>
+          </w:tcPr>
+          <w:p>
+            <w:r>
+              <w:t>Good practice</w:t>
+            </w:r>
+          </w:p>
+        </w:tc>
+      </w:tr>
+      <w:tr>
+        <w:tc>
+          <w:tcPr>
+            <w:tcW w:type="dxa" w:w="2041"/>
+          </w:tcPr>
+          <w:p>
+            <w:r>
+              <w:t>Say "Sarawak Government"</w:t>
+            </w:r>
+          </w:p>
+        </w:tc>
+        <w:tc>
+          <w:tcPr>
+            <w:tcW w:type="dxa" w:w="4195"/>
+          </w:tcPr>
+          <w:p>
+            <w:r>
+              <w:t>Prefer "Sarawak Government" or "Kerajaan Sarawak" to "State Government".</w:t>
+            </w:r>
+          </w:p>
+        </w:tc>
+        <w:tc>
+          <w:tcPr>
+            <w:tcW w:type="dxa" w:w="1247"/>
+          </w:tcPr>
+          <w:p>
+            <w:r>
+              <w:t>Tip</w:t>
             </w:r>
           </w:p>
         </w:tc>
@@ -2374,7 +2416,7 @@
           </w:tcPr>
           <w:p>
             <w:r>
-              <w:t>Use official .gov.my websites and emails. No Gmail or personal numbers.</w:t>
+              <w:t>Use your agency's official website and email. No Gmail or personal numbers.</w:t>
             </w:r>
           </w:p>
         </w:tc>
@@ -2700,7 +2742,7 @@
           </w:tcPr>
           <w:p>
             <w:r>
-              <w:t>Material for public use carries the Sarawak state crest (Jata Negeri Sarawak).</w:t>
+              <w:t>Public material from ministries and government departments carries the Sarawak state crest (Jata Negeri Sarawak). Statutory bodies and councils use their own logo; they may use the crest only with the State Secretary's written permission.</w:t>
             </w:r>
           </w:p>
         </w:tc>
@@ -3180,7 +3222,7 @@
           </w:tcPr>
           <w:p>
             <w:r>
-              <w:t>Official titles are used: Premier of Sarawak / Premier Sarawak, Deputy Premier, Kerajaan Sarawak / Sarawak Government.</w:t>
+              <w:t>The current head of government is titled Premier of Sarawak / Premier Sarawak, and the deputy Deputy Premier.</w:t>
             </w:r>
           </w:p>
         </w:tc>
@@ -3190,7 +3232,7 @@
           </w:tcPr>
           <w:p>
             <w:r>
-              <w:t>"Chief Minister", "Ketua Menteri" or "Sarawak State Government" used for the current office is a breach.</w:t>
+              <w:t>"Chief Minister" or "Ketua Menteri" used for the current office holder is a breach. A clearly historical reference (an event before 2022) passes. An old department name such as "Jabatan Ketua Menteri" or "JKM" is BC-1.6, not this rule: do not fail both for the same words. How the government itself is named is BC-4.6.</w:t>
             </w:r>
           </w:p>
         </w:tc>
@@ -3298,7 +3340,7 @@
           </w:tcPr>
           <w:p>
             <w:r>
-              <w:t>BC-5.1</w:t>
+              <w:t>BC-4.6</w:t>
             </w:r>
           </w:p>
         </w:tc>
@@ -3308,7 +3350,7 @@
           </w:tcPr>
           <w:p>
             <w:r>
-              <w:t>Development, economic, social or environmental material links to PCDS 2030 and its pillar(s).</w:t>
+              <w:t>The government is named Sarawak Government / Kerajaan Sarawak rather than State Government / Kerajaan Negeri.</w:t>
             </w:r>
           </w:p>
         </w:tc>
@@ -3318,7 +3360,7 @@
           </w:tcPr>
           <w:p>
             <w:r>
-              <w:t>A programme presented with no link to Economic Prosperity, Social Inclusivity or Environmental Sustainability where one applies.</w:t>
+              <w:t>"Sarawak State Government" or "State Government" used for the government today is a tip, never more. A clearly historical reference passes.</w:t>
             </w:r>
           </w:p>
         </w:tc>
@@ -3330,7 +3372,7 @@
           </w:tcPr>
           <w:p>
             <w:r>
-              <w:t>BC-5.2</w:t>
+              <w:t>BC-5.1</w:t>
             </w:r>
           </w:p>
         </w:tc>
@@ -3340,7 +3382,7 @@
           </w:tcPr>
           <w:p>
             <w:r>
-              <w:t>No statement contradicts published state policy or the PCDS 2030 direction.</w:t>
+              <w:t>Development, economic, social or environmental material links to PCDS 2030 and its pillar(s).</w:t>
             </w:r>
           </w:p>
         </w:tc>
@@ -3350,7 +3392,7 @@
           </w:tcPr>
           <w:p>
             <w:r>
-              <w:t>E.g. promoting expansion of coal or open burning against the green economy and renewable energy direction; dismissing digital transformation.</w:t>
+              <w:t>A programme presented with no link to Economic Prosperity, Social Inclusivity or Environmental Sustainability where one applies.</w:t>
             </w:r>
           </w:p>
         </w:tc>
@@ -3362,7 +3404,7 @@
           </w:tcPr>
           <w:p>
             <w:r>
-              <w:t>BC-5.3</w:t>
+              <w:t>BC-5.2</w:t>
             </w:r>
           </w:p>
         </w:tc>
@@ -3372,7 +3414,7 @@
           </w:tcPr>
           <w:p>
             <w:r>
-              <w:t>Figures, targets, budgets and dates are sourced or marked for verification; no commitments beyond what has been approved.</w:t>
+              <w:t>No statement contradicts published state policy or the PCDS 2030 direction.</w:t>
             </w:r>
           </w:p>
         </w:tc>
@@ -3382,7 +3424,7 @@
           </w:tcPr>
           <w:p>
             <w:r>
-              <w:t>Specific RM amounts, percentages or completion dates with no source or approval reference.</w:t>
+              <w:t>E.g. promoting expansion of coal or open burning against the green economy and renewable energy direction; dismissing digital transformation.</w:t>
             </w:r>
           </w:p>
         </w:tc>
@@ -3394,7 +3436,7 @@
           </w:tcPr>
           <w:p>
             <w:r>
-              <w:t>BC-5.4</w:t>
+              <w:t>BC-5.3</w:t>
             </w:r>
           </w:p>
         </w:tc>
@@ -3404,7 +3446,7 @@
           </w:tcPr>
           <w:p>
             <w:r>
-              <w:t>The state vision is quoted verbatim when quoted.</w:t>
+              <w:t>Figures, targets, budgets and dates are sourced or marked for verification; no commitments beyond what has been approved.</w:t>
             </w:r>
           </w:p>
         </w:tc>
@@ -3414,7 +3456,7 @@
           </w:tcPr>
           <w:p>
             <w:r>
-              <w:t>Paraphrased or altered wording presented as the official vision.</w:t>
+              <w:t>Specific RM amounts, percentages or completion dates with no source or approval reference.</w:t>
             </w:r>
           </w:p>
         </w:tc>
@@ -3426,7 +3468,7 @@
           </w:tcPr>
           <w:p>
             <w:r>
-              <w:t>BC-6.1</w:t>
+              <w:t>BC-5.4</w:t>
             </w:r>
           </w:p>
         </w:tc>
@@ -3436,7 +3478,7 @@
           </w:tcPr>
           <w:p>
             <w:r>
-              <w:t>Imagery represents Sarawak's communities inclusively and respectfully, in authentic Sarawak settings.</w:t>
+              <w:t>The state vision is quoted verbatim when quoted.</w:t>
             </w:r>
           </w:p>
         </w:tc>
@@ -3446,7 +3488,7 @@
           </w:tcPr>
           <w:p>
             <w:r>
-              <w:t>Generic foreign stock scenes standing in for Sarawak; one community shown as representing all.</w:t>
+              <w:t>Paraphrased or altered wording presented as the official vision.</w:t>
             </w:r>
           </w:p>
         </w:tc>
@@ -3458,7 +3500,7 @@
           </w:tcPr>
           <w:p>
             <w:r>
-              <w:t>BC-6.2</w:t>
+              <w:t>BC-6.1</w:t>
             </w:r>
           </w:p>
         </w:tc>
@@ -3468,7 +3510,7 @@
           </w:tcPr>
           <w:p>
             <w:r>
-              <w:t>No low-resolution, pixelated or watermarked images.</w:t>
+              <w:t>Imagery represents Sarawak's communities inclusively and respectfully, in authentic Sarawak settings.</w:t>
             </w:r>
           </w:p>
         </w:tc>
@@ -3478,7 +3520,7 @@
           </w:tcPr>
           <w:p>
             <w:r>
-              <w:t>Visible stock watermarks, blocky compression, stretched photos.</w:t>
+              <w:t>Generic foreign stock scenes standing in for Sarawak; one community shown as representing all.</w:t>
             </w:r>
           </w:p>
         </w:tc>
@@ -3490,7 +3532,7 @@
           </w:tcPr>
           <w:p>
             <w:r>
-              <w:t>BC-6.3</w:t>
+              <w:t>BC-6.2</w:t>
             </w:r>
           </w:p>
         </w:tc>
@@ -3500,7 +3542,7 @@
           </w:tcPr>
           <w:p>
             <w:r>
-              <w:t>Identifiable people, especially children, need recorded consent.</w:t>
+              <w:t>No low-resolution, pixelated or watermarked images.</w:t>
             </w:r>
           </w:p>
         </w:tc>
@@ -3510,7 +3552,7 @@
           </w:tcPr>
           <w:p>
             <w:r>
-              <w:t>Close-up of identifiable individuals: flag for consent confirmation.</w:t>
+              <w:t>Visible stock watermarks, blocky compression, stretched photos.</w:t>
             </w:r>
           </w:p>
         </w:tc>
@@ -3522,7 +3564,7 @@
           </w:tcPr>
           <w:p>
             <w:r>
-              <w:t>BC-6.4</w:t>
+              <w:t>BC-6.3</w:t>
             </w:r>
           </w:p>
         </w:tc>
@@ -3532,7 +3574,7 @@
           </w:tcPr>
           <w:p>
             <w:r>
-              <w:t>Cultural motifs are used respectfully, not distorted or used as filler decoration.</w:t>
+              <w:t>Identifiable people, especially children, need recorded consent.</w:t>
             </w:r>
           </w:p>
         </w:tc>
@@ -3542,7 +3584,7 @@
           </w:tcPr>
           <w:p>
             <w:r>
-              <w:t>Recoloured, cropped or mixed motifs from different communities used as background filler.</w:t>
+              <w:t>Close-up of identifiable individuals: flag for consent confirmation.</w:t>
             </w:r>
           </w:p>
         </w:tc>
@@ -3554,7 +3596,7 @@
           </w:tcPr>
           <w:p>
             <w:r>
-              <w:t>BC-6.5</w:t>
+              <w:t>BC-6.4</w:t>
             </w:r>
           </w:p>
         </w:tc>
@@ -3564,7 +3606,7 @@
           </w:tcPr>
           <w:p>
             <w:r>
-              <w:t>Maps show Sarawak's boundaries correctly.</w:t>
+              <w:t>Cultural motifs are used respectfully, not distorted or used as filler decoration.</w:t>
             </w:r>
           </w:p>
         </w:tc>
@@ -3574,7 +3616,7 @@
           </w:tcPr>
           <w:p>
             <w:r>
-              <w:t>Missing districts, wrong borders, or Sarawak drawn inaccurately.</w:t>
+              <w:t>Recoloured, cropped or mixed motifs from different communities used as background filler.</w:t>
             </w:r>
           </w:p>
         </w:tc>
@@ -3586,7 +3628,7 @@
           </w:tcPr>
           <w:p>
             <w:r>
-              <w:t>BC-7.1</w:t>
+              <w:t>BC-6.5</w:t>
             </w:r>
           </w:p>
         </w:tc>
@@ -3596,7 +3638,7 @@
           </w:tcPr>
           <w:p>
             <w:r>
-              <w:t>Text has enough contrast with its background (at least 4.5:1 for body text).</w:t>
+              <w:t>Maps show Sarawak's boundaries correctly.</w:t>
             </w:r>
           </w:p>
         </w:tc>
@@ -3606,7 +3648,7 @@
           </w:tcPr>
           <w:p>
             <w:r>
-              <w:t>Yellow text on white, grey on grey, text over photos without a panel.</w:t>
+              <w:t>Missing districts, wrong borders, or Sarawak drawn inaccurately.</w:t>
             </w:r>
           </w:p>
         </w:tc>
@@ -3618,7 +3660,7 @@
           </w:tcPr>
           <w:p>
             <w:r>
-              <w:t>BC-7.2</w:t>
+              <w:t>BC-7.1</w:t>
             </w:r>
           </w:p>
         </w:tc>
@@ -3628,7 +3670,7 @@
           </w:tcPr>
           <w:p>
             <w:r>
-              <w:t>Meaning is not carried by colour alone.</w:t>
+              <w:t>Text has enough contrast with its background (at least 4.5:1 for body text).</w:t>
             </w:r>
           </w:p>
         </w:tc>
@@ -3638,7 +3680,7 @@
           </w:tcPr>
           <w:p>
             <w:r>
-              <w:t>Charts or statuses distinguished only by red versus green.</w:t>
+              <w:t>Yellow text on white, grey on grey, text over photos without a panel.</w:t>
             </w:r>
           </w:p>
         </w:tc>
@@ -3650,7 +3692,7 @@
           </w:tcPr>
           <w:p>
             <w:r>
-              <w:t>BC-8.1</w:t>
+              <w:t>BC-7.2</w:t>
             </w:r>
           </w:p>
         </w:tc>
@@ -3660,7 +3702,7 @@
           </w:tcPr>
           <w:p>
             <w:r>
-              <w:t>The issuing agency is named, with a contact (phone, email or website).</w:t>
+              <w:t>Meaning is not carried by colour alone.</w:t>
             </w:r>
           </w:p>
         </w:tc>
@@ -3670,7 +3712,7 @@
           </w:tcPr>
           <w:p>
             <w:r>
-              <w:t>No agency name or no way to contact it.</w:t>
+              <w:t>Charts or statuses distinguished only by red versus green.</w:t>
             </w:r>
           </w:p>
         </w:tc>
@@ -3682,6 +3724,38 @@
           </w:tcPr>
           <w:p>
             <w:r>
+              <w:t>BC-8.1</w:t>
+            </w:r>
+          </w:p>
+        </w:tc>
+        <w:tc>
+          <w:tcPr>
+            <w:tcW w:type="dxa" w:w="4082"/>
+          </w:tcPr>
+          <w:p>
+            <w:r>
+              <w:t>The issuing agency is named, with a contact (phone, email or website).</w:t>
+            </w:r>
+          </w:p>
+        </w:tc>
+        <w:tc>
+          <w:tcPr>
+            <w:tcW w:type="dxa" w:w="4535"/>
+          </w:tcPr>
+          <w:p>
+            <w:r>
+              <w:t>No agency name or no way to contact it.</w:t>
+            </w:r>
+          </w:p>
+        </w:tc>
+      </w:tr>
+      <w:tr>
+        <w:tc>
+          <w:tcPr>
+            <w:tcW w:type="dxa" w:w="907"/>
+          </w:tcPr>
+          <w:p>
+            <w:r>
               <w:t>BC-8.2</w:t>
             </w:r>
           </w:p>
@@ -3692,7 +3766,7 @@
           </w:tcPr>
           <w:p>
             <w:r>
-              <w:t>Official channels only: a sarawak.gov.my (or agency .gov.my) website and official email; no personal or free webmail addresses.</w:t>
+              <w:t>Official channels only: the agency's official website and email (sarawak.gov.my, an agency .gov.my, or the statutory body's own official domain); no personal or free webmail addresses.</w:t>
             </w:r>
           </w:p>
         </w:tc>

</xml_diff>